<commit_message>
Apply Jeroen's round 3 co-author review feedback
Regenerate submission documents for round 3 after Jeroen's 2026-04-23
review. Manuscript edits (Setting tense unification, p.5 sentence break,
p.7 duplicate removal, mixed-effects terminology, Table 6 removal) are
already committed; this commit refreshes the derived artifacts.

- co-author-review/20260423-05-jeroen-revision/: capture incoming review
  email and draft reply
- 3_review/new_2026_04_24_study1_manuscript.docx: replaces 4/22 version
- 3_review/one_by_one_reply.docx: regenerated from updated one_by_one_reply.md
- 3_review/tracked_changes.docx: regenerated vs round-2 submitted baseline
- Multimedia Appendix 4 docx: build byproduct

Co-Authored-By: Claude Opus 4.7 (1M context) <noreply@anthropic.com>
</commit_message>
<xml_diff>
--- a/submission/JMIR-Medical-Education/3_review/one_by_one_reply.docx
+++ b/submission/JMIR-Medical-Education/3_review/one_by_one_reply.docx
@@ -2,7 +2,7 @@
 <file path=word/document.xml><?xml version="1.0" encoding="utf-8"?>
 <w:document xmlns:w="http://schemas.openxmlformats.org/wordprocessingml/2006/main" xmlns:m="http://schemas.openxmlformats.org/officeDocument/2006/math" xmlns:r="http://schemas.openxmlformats.org/officeDocument/2006/relationships" xmlns:o="urn:schemas-microsoft-com:office:office" xmlns:v="urn:schemas-microsoft-com:vml" xmlns:w10="urn:schemas-microsoft-com:office:word" xmlns:a="http://schemas.openxmlformats.org/drawingml/2006/main" xmlns:pic="http://schemas.openxmlformats.org/drawingml/2006/picture" xmlns:wp="http://schemas.openxmlformats.org/drawingml/2006/wordprocessingDrawing">
   <w:body>
-    <w:bookmarkStart w:id="37" w:name="reply-to-reviewers-round-2"/>
+    <w:bookmarkStart w:id="48" w:name="reply-to-reviewers-round-2"/>
     <w:p>
       <w:pPr>
         <w:pStyle w:val="Heading1"/>
@@ -11,7 +11,7 @@
         <w:t xml:space="preserve">Reply to Reviewers (Round 2)</w:t>
       </w:r>
     </w:p>
-    <w:bookmarkStart w:id="14" w:name="editor-comments"/>
+    <w:bookmarkStart w:id="25" w:name="editor-comments"/>
     <w:p>
       <w:pPr>
         <w:pStyle w:val="Heading2"/>
@@ -20,7 +20,7 @@
         <w:t xml:space="preserve">EDITOR COMMENTS</w:t>
       </w:r>
     </w:p>
-    <w:bookmarkStart w:id="9" w:name="general-comments"/>
+    <w:bookmarkStart w:id="20" w:name="general-comments"/>
     <w:p>
       <w:pPr>
         <w:pStyle w:val="Heading3"/>
@@ -45,8 +45,8 @@
         <w:t xml:space="preserve">RESPONSE: We thank the Editor and the reviewers for the second round of constructive feedback. Each Editor and reviewer comment is addressed individually below.</w:t>
       </w:r>
     </w:p>
-    <w:bookmarkEnd w:id="9"/>
-    <w:bookmarkStart w:id="10" w:name="editor-comment.1"/>
+    <w:bookmarkEnd w:id="20"/>
+    <w:bookmarkStart w:id="21" w:name="editor-comment.1"/>
     <w:p>
       <w:pPr>
         <w:pStyle w:val="Heading3"/>
@@ -191,8 +191,8 @@
         <w:t xml:space="preserve">Coverage of the JARS-Quant elements added in the first round of revision (Participants with Inclusion and Exclusion, Participant Characteristics, and Sampling Procedures; Materials; Sample Size, Power, and Precision; Data Collection; and Quantitative Analysis with effect sizes, confidence intervals, alpha level, multiple-comparison correction, and the random-effects structure of the cumulative link mixed models) remain in place. The remaining JARS-Quant element on missing data is addressed separately in our response to Editor Comment 4 below.</w:t>
       </w:r>
     </w:p>
-    <w:bookmarkEnd w:id="10"/>
-    <w:bookmarkStart w:id="11" w:name="editor-comment.2"/>
+    <w:bookmarkEnd w:id="21"/>
+    <w:bookmarkStart w:id="22" w:name="editor-comment.2"/>
     <w:p>
       <w:pPr>
         <w:pStyle w:val="Heading3"/>
@@ -214,7 +214,7 @@
         <w:pStyle w:val="FirstParagraph"/>
       </w:pPr>
       <w:r>
-        <w:t xml:space="preserve">RESPONSE: Thank you for this helpful suggestion and for directing us to the Ahmed et al. (2025) article on thematic analysis (Journal of Medicine, Surgery, and Public Health, 6, 100198). We have designed and added a new figure (Figure 2, thematic map) at the opening of the Qualitative analysis subsection of the Results, immediately before Table 2.</w:t>
+        <w:t xml:space="preserve">RESPONSE: Thank you for this helpful suggestion and for directing us to the Ahmed et al. (2025) article on thematic analysis (Journal of Medicine, Surgery, and Public Health, 6, 100198). We have designed and added a new figure (Figure 6, thematic map) at the opening of the Qualitative Analysis subsection of the Results. Because the thematic map visualizes the same themes and sub-themes that were also presented in the Themes table, we removed the Themes table to avoid redundancy.</w:t>
       </w:r>
     </w:p>
     <w:p>
@@ -222,19 +222,19 @@
         <w:pStyle w:val="BodyText"/>
       </w:pPr>
       <w:r>
-        <w:t xml:space="preserve">The new figure is introduced by the following revised passage, which replaces the previous single-sentence pointer to Table 2:</w:t>
-      </w:r>
-    </w:p>
-    <w:p>
-      <w:pPr>
-        <w:pStyle w:val="BlockText"/>
-      </w:pPr>
-      <w:r>
-        <w:t xml:space="preserve">“The qualitative analysis of the free-text comments provided by the evaluators revealed several themes regarding the differences between AI and supervisor feedback. Following the thematic-map guidance of Ahmed et al. (2025), the thematic map in Figure 2 visualizes the research question, the five themes, and their sub-themes arranged by feedback provider. The complete list of sub-themes by provider is shown in Table 2.”</w:t>
-      </w:r>
-    </w:p>
-    <w:bookmarkEnd w:id="11"/>
-    <w:bookmarkStart w:id="12" w:name="editor-comment.3"/>
+        <w:t xml:space="preserve">The new figure is introduced by the following revised passage, which replaces the previous single-sentence pointer to the Themes table:</w:t>
+      </w:r>
+    </w:p>
+    <w:p>
+      <w:pPr>
+        <w:pStyle w:val="BlockText"/>
+      </w:pPr>
+      <w:r>
+        <w:t xml:space="preserve">“The qualitative analysis of the free-text comments provided by the evaluators revealed several themes regarding the differences between AI and supervisor feedback. Following the thematic-map guidance of Ahmed et al. (2025), the thematic map in Figure 6 visualizes the research question, the five themes, and their sub-themes arranged by feedback provider.”</w:t>
+      </w:r>
+    </w:p>
+    <w:bookmarkEnd w:id="22"/>
+    <w:bookmarkStart w:id="23" w:name="editor-comment.3"/>
     <w:p>
       <w:pPr>
         <w:pStyle w:val="Heading3"/>
@@ -372,8 +372,8 @@
         <w:t xml:space="preserve">) and statements of future research directions.</w:t>
       </w:r>
     </w:p>
-    <w:bookmarkEnd w:id="12"/>
-    <w:bookmarkStart w:id="13" w:name="editor-comment.4"/>
+    <w:bookmarkEnd w:id="23"/>
+    <w:bookmarkStart w:id="24" w:name="editor-comment.4"/>
     <w:p>
       <w:pPr>
         <w:pStyle w:val="Heading3"/>
@@ -413,9 +413,9 @@
         </w:pict>
       </w:r>
     </w:p>
-    <w:bookmarkEnd w:id="13"/>
-    <w:bookmarkEnd w:id="14"/>
-    <w:bookmarkStart w:id="24" w:name="reviewer-f"/>
+    <w:bookmarkEnd w:id="24"/>
+    <w:bookmarkEnd w:id="25"/>
+    <w:bookmarkStart w:id="35" w:name="reviewer-f"/>
     <w:p>
       <w:pPr>
         <w:pStyle w:val="Heading2"/>
@@ -424,7 +424,7 @@
         <w:t xml:space="preserve">Reviewer F</w:t>
       </w:r>
     </w:p>
-    <w:bookmarkStart w:id="15" w:name="general-comments-1"/>
+    <w:bookmarkStart w:id="26" w:name="general-comments-1"/>
     <w:p>
       <w:pPr>
         <w:pStyle w:val="Heading3"/>
@@ -455,8 +455,8 @@
         <w:t xml:space="preserve">RESPONSE: We thank you for the detailed second-round comments, which have substantially sharpened the framing of the paper. Point-by-point responses follow.</w:t>
       </w:r>
     </w:p>
-    <w:bookmarkEnd w:id="15"/>
-    <w:bookmarkStart w:id="19" w:name="major"/>
+    <w:bookmarkEnd w:id="26"/>
+    <w:bookmarkStart w:id="30" w:name="major"/>
     <w:p>
       <w:pPr>
         <w:pStyle w:val="Heading3"/>
@@ -465,7 +465,7 @@
         <w:t xml:space="preserve">Major</w:t>
       </w:r>
     </w:p>
-    <w:bookmarkStart w:id="16" w:name="X79e372be8bd0e20b9c126bb23e801f00fccf157"/>
+    <w:bookmarkStart w:id="27" w:name="X79e372be8bd0e20b9c126bb23e801f00fccf157"/>
     <w:p>
       <w:pPr>
         <w:pStyle w:val="Heading4"/>
@@ -808,8 +808,8 @@
         <w:t xml:space="preserve">“Furthermore, our results showed no correlation between AI feedback length and rubric scores, while supervisor feedback demonstrated a positive correlation between length and rubric scores.”</w:t>
       </w:r>
     </w:p>
-    <w:bookmarkEnd w:id="16"/>
-    <w:bookmarkStart w:id="17" w:name="Xa720d265eafaadb7207e4e4df8693bb373a4ffc"/>
+    <w:bookmarkEnd w:id="27"/>
+    <w:bookmarkStart w:id="28" w:name="Xa720d265eafaadb7207e4e4df8693bb373a4ffc"/>
     <w:p>
       <w:pPr>
         <w:pStyle w:val="Heading4"/>
@@ -926,8 +926,8 @@
         <w:t xml:space="preserve">“Eighth, our study evaluated the structural quality of feedback as assessed by third-party evaluators using the rubric, but did not examine whether AI-generated or supervisor-provided feedback, when delivered to students, elicited different learning behaviors, revisions, engagement, or clinical improvement. Because our design measured judgments by evaluators rather than responses by learner recipients, source-attribution effects that may arise when identifiable AI feedback is delivered directly to students (Morris &amp; Maes, 2026) fall outside the scope of our data. The relationship between perceived feedback quality, source attribution, and actual educational outcomes remains an important area for future investigation.”</w:t>
       </w:r>
     </w:p>
-    <w:bookmarkEnd w:id="17"/>
-    <w:bookmarkStart w:id="18" w:name="Xd46d94ba16e0564b5c65ba4f940d00535bb2bc2"/>
+    <w:bookmarkEnd w:id="28"/>
+    <w:bookmarkStart w:id="29" w:name="Xd46d94ba16e0564b5c65ba4f940d00535bb2bc2"/>
     <w:p>
       <w:pPr>
         <w:pStyle w:val="Heading4"/>
@@ -968,9 +968,9 @@
         <w:t xml:space="preserve">“Underlying both direct delivery and hybrid configurations is the prompt itself, an object of pedagogical design that shapes what the AI produces in any deployment model. In our case, embedding the rubric criteria directly in the prompt operationalized a particular conception of feedback quality in AI generation. This is analogous to constructive alignment in instructional design (Biggs, 1996), where intended outcomes are aligned with the activities producing them. Recent applied guidance in health professions education has similarly recommended grounding generative AI prompts in institutional pedagogical and assessment frameworks (Sánchez-Mendiola et al., 2025). The rubric-score consistency we observed for AI feedback is therefore best read not as an inherent property of GPT-4o but as an outcome of this prompt configuration, consistent with experimental evidence that detailed prompts combined with low temperature settings yield near-perfect inter-replicate consistency in LLM rubric grading (Yavuz et al., 2024). The same design lever is available to other educators and institutions seeking to align AI feedback with their own assessment frameworks.”</w:t>
       </w:r>
     </w:p>
-    <w:bookmarkEnd w:id="18"/>
-    <w:bookmarkEnd w:id="19"/>
-    <w:bookmarkStart w:id="23" w:name="minor"/>
+    <w:bookmarkEnd w:id="29"/>
+    <w:bookmarkEnd w:id="30"/>
+    <w:bookmarkStart w:id="34" w:name="minor"/>
     <w:p>
       <w:pPr>
         <w:pStyle w:val="Heading3"/>
@@ -979,7 +979,7 @@
         <w:t xml:space="preserve">Minor</w:t>
       </w:r>
     </w:p>
-    <w:bookmarkStart w:id="20" w:name="f-minor.1-methodological-repetition"/>
+    <w:bookmarkStart w:id="31" w:name="f-minor.1-methodological-repetition"/>
     <w:p>
       <w:pPr>
         <w:pStyle w:val="Heading4"/>
@@ -1053,8 +1053,8 @@
         <w:t xml:space="preserve">The definitional statement in the Methods (Prompt Development subsection), the brief mention within the Discussion Comparison with the Literature subsection, the new Implications paragraph on prompt design as an operationalization of educational values, and the Conclusion were retained because each serves a distinct framing purpose.</w:t>
       </w:r>
     </w:p>
-    <w:bookmarkEnd w:id="20"/>
-    <w:bookmarkStart w:id="21" w:name="f-minor.2-table-2-density"/>
+    <w:bookmarkEnd w:id="31"/>
+    <w:bookmarkStart w:id="32" w:name="f-minor.2-table-2-density"/>
     <w:p>
       <w:pPr>
         <w:pStyle w:val="Heading4"/>
@@ -1079,8 +1079,8 @@
         <w:t xml:space="preserve">RESPONSE: Thank you for the suggestion. We have trimmed Table 2 from seven columns to five, retaining Item, AI Mean (95% CI), Supervisor Mean (95% CI), Cohen d (95% CI), and Bonferroni-corrected P value. The Mean Difference (derivable from the two means) and the uncorrected P value (redundant given the corrected value) have been moved to a new Multimedia Appendix 4 that reproduces the full seven-column table. The Table 2 caption and the Data Availability statement have been updated to point to Multimedia Appendix 4.</w:t>
       </w:r>
     </w:p>
-    <w:bookmarkEnd w:id="21"/>
-    <w:bookmarkStart w:id="22" w:name="Xc0fd9eb19a12900f2d315c652c6f8f2c007e37f"/>
+    <w:bookmarkEnd w:id="32"/>
+    <w:bookmarkStart w:id="33" w:name="Xc0fd9eb19a12900f2d315c652c6f8f2c007e37f"/>
     <w:p>
       <w:pPr>
         <w:pStyle w:val="Heading4"/>
@@ -1128,10 +1128,10 @@
         </w:pict>
       </w:r>
     </w:p>
-    <w:bookmarkEnd w:id="22"/>
-    <w:bookmarkEnd w:id="23"/>
-    <w:bookmarkEnd w:id="24"/>
-    <w:bookmarkStart w:id="29" w:name="reviewer-g"/>
+    <w:bookmarkEnd w:id="33"/>
+    <w:bookmarkEnd w:id="34"/>
+    <w:bookmarkEnd w:id="35"/>
+    <w:bookmarkStart w:id="40" w:name="reviewer-g"/>
     <w:p>
       <w:pPr>
         <w:pStyle w:val="Heading2"/>
@@ -1140,7 +1140,7 @@
         <w:t xml:space="preserve">Reviewer G</w:t>
       </w:r>
     </w:p>
-    <w:bookmarkStart w:id="25" w:name="general-comments-2"/>
+    <w:bookmarkStart w:id="36" w:name="general-comments-2"/>
     <w:p>
       <w:pPr>
         <w:pStyle w:val="Heading3"/>
@@ -1165,8 +1165,8 @@
         <w:t xml:space="preserve">RESPONSE: We thank the reviewer for the careful review across both rounds.</w:t>
       </w:r>
     </w:p>
-    <w:bookmarkEnd w:id="25"/>
-    <w:bookmarkStart w:id="28" w:name="minor-1"/>
+    <w:bookmarkEnd w:id="36"/>
+    <w:bookmarkStart w:id="39" w:name="minor-1"/>
     <w:p>
       <w:pPr>
         <w:pStyle w:val="Heading3"/>
@@ -1175,7 +1175,7 @@
         <w:t xml:space="preserve">Minor</w:t>
       </w:r>
     </w:p>
-    <w:bookmarkStart w:id="26" w:name="Xa23263c2a294413f8cfb4ecc48b100779b779f2"/>
+    <w:bookmarkStart w:id="37" w:name="Xa23263c2a294413f8cfb4ecc48b100779b779f2"/>
     <w:p>
       <w:pPr>
         <w:pStyle w:val="Heading4"/>
@@ -1200,8 +1200,8 @@
         <w:t xml:space="preserve">RESPONSE: Done. The Limitations section has been split so that each of the eight limitations (First through Eighth) now occupies its own paragraph.</w:t>
       </w:r>
     </w:p>
-    <w:bookmarkEnd w:id="26"/>
-    <w:bookmarkStart w:id="27" w:name="g-minor.2-gaidet-reference"/>
+    <w:bookmarkEnd w:id="37"/>
+    <w:bookmarkStart w:id="38" w:name="g-minor.2-gaidet-reference"/>
     <w:p>
       <w:pPr>
         <w:pStyle w:val="Heading4"/>
@@ -1241,10 +1241,10 @@
         </w:pict>
       </w:r>
     </w:p>
-    <w:bookmarkEnd w:id="27"/>
-    <w:bookmarkEnd w:id="28"/>
-    <w:bookmarkEnd w:id="29"/>
-    <w:bookmarkStart w:id="34" w:name="reviewer-l"/>
+    <w:bookmarkEnd w:id="38"/>
+    <w:bookmarkEnd w:id="39"/>
+    <w:bookmarkEnd w:id="40"/>
+    <w:bookmarkStart w:id="45" w:name="reviewer-l"/>
     <w:p>
       <w:pPr>
         <w:pStyle w:val="Heading2"/>
@@ -1253,7 +1253,7 @@
         <w:t xml:space="preserve">Reviewer L</w:t>
       </w:r>
     </w:p>
-    <w:bookmarkStart w:id="30" w:name="general-comments-3"/>
+    <w:bookmarkStart w:id="41" w:name="general-comments-3"/>
     <w:p>
       <w:pPr>
         <w:pStyle w:val="Heading3"/>
@@ -1278,8 +1278,8 @@
         <w:t xml:space="preserve">RESPONSE: We thank the reviewer for the positive assessment.</w:t>
       </w:r>
     </w:p>
-    <w:bookmarkEnd w:id="30"/>
-    <w:bookmarkStart w:id="33" w:name="minor-2"/>
+    <w:bookmarkEnd w:id="41"/>
+    <w:bookmarkStart w:id="44" w:name="minor-2"/>
     <w:p>
       <w:pPr>
         <w:pStyle w:val="Heading3"/>
@@ -1288,7 +1288,7 @@
         <w:t xml:space="preserve">Minor</w:t>
       </w:r>
     </w:p>
-    <w:bookmarkStart w:id="31" w:name="l-minor.1-languagecontext-dependency"/>
+    <w:bookmarkStart w:id="42" w:name="l-minor.1-languagecontext-dependency"/>
     <w:p>
       <w:pPr>
         <w:pStyle w:val="Heading4"/>
@@ -1353,8 +1353,8 @@
         <w:t xml:space="preserve">Together these passages cover both the language-performance dependency (with Strasser et al., 2026 and Harigai et al., 2024 as empirical anchors) and the cultural-reception dependency (Nishigori, 2014), and explicitly flag the external-validity implication for cross-linguistic and cross-cultural extension.</w:t>
       </w:r>
     </w:p>
-    <w:bookmarkEnd w:id="31"/>
-    <w:bookmarkStart w:id="32" w:name="Xa02b0c8609c3cc50a8580c29be3e8f945406dcd"/>
+    <w:bookmarkEnd w:id="42"/>
+    <w:bookmarkStart w:id="43" w:name="Xa02b0c8609c3cc50a8580c29be3e8f945406dcd"/>
     <w:p>
       <w:pPr>
         <w:pStyle w:val="Heading4"/>
@@ -1394,10 +1394,10 @@
         </w:pict>
       </w:r>
     </w:p>
-    <w:bookmarkEnd w:id="32"/>
-    <w:bookmarkEnd w:id="33"/>
-    <w:bookmarkEnd w:id="34"/>
-    <w:bookmarkStart w:id="36" w:name="reviewer-n"/>
+    <w:bookmarkEnd w:id="43"/>
+    <w:bookmarkEnd w:id="44"/>
+    <w:bookmarkEnd w:id="45"/>
+    <w:bookmarkStart w:id="47" w:name="reviewer-n"/>
     <w:p>
       <w:pPr>
         <w:pStyle w:val="Heading2"/>
@@ -1406,7 +1406,7 @@
         <w:t xml:space="preserve">Reviewer N</w:t>
       </w:r>
     </w:p>
-    <w:bookmarkStart w:id="35" w:name="general-comments-4"/>
+    <w:bookmarkStart w:id="46" w:name="general-comments-4"/>
     <w:p>
       <w:pPr>
         <w:pStyle w:val="Heading3"/>
@@ -1431,9 +1431,9 @@
         <w:t xml:space="preserve">RESPONSE: Thank you for your careful review throughout both rounds. We appreciate your confirmation that the previous concerns have been fully addressed.</w:t>
       </w:r>
     </w:p>
-    <w:bookmarkEnd w:id="35"/>
-    <w:bookmarkEnd w:id="36"/>
-    <w:bookmarkEnd w:id="37"/>
+    <w:bookmarkEnd w:id="46"/>
+    <w:bookmarkEnd w:id="47"/>
+    <w:bookmarkEnd w:id="48"/>
     <w:sectPr>
       <w:footnotePr>
         <w:numRestart w:val="eachSect"/>
@@ -1555,10 +1555,10 @@
   <w:docDefaults>
     <w:rPrDefault>
       <w:rPr>
-        <w:rFonts w:asciiTheme="minorHAnsi" w:cstheme="minorBidi" w:eastAsiaTheme="minorEastAsia" w:hAnsiTheme="minorHAnsi"/>
+        <w:rFonts w:asciiTheme="minorHAnsi" w:cstheme="minorBidi" w:eastAsiaTheme="minorHAnsi" w:hAnsiTheme="minorHAnsi"/>
         <w:sz w:val="24"/>
         <w:szCs w:val="24"/>
-        <w:lang w:bidi="ar-SA" w:eastAsia="zh-CN" w:val="en-US"/>
+        <w:lang w:bidi="ar-SA" w:eastAsia="en-US" w:val="en-US"/>
       </w:rPr>
     </w:rPrDefault>
     <w:pPrDefault>
@@ -2099,6 +2099,13 @@
       </w:tblCellMar>
     </w:tblPr>
     <w:tblStylePr w:type="firstRow">
+      <w:tblPr>
+        <w:jc w:val="left"/>
+        <w:tblInd w:type="dxa" w:w="0"/>
+      </w:tblPr>
+      <w:trPr>
+        <w:jc w:val="left"/>
+      </w:trPr>
       <w:tcPr>
         <w:tcBorders>
           <w:bottom w:val="single"/>

</xml_diff>